<commit_message>
clean: Xoa triet de moi tu khoa va doan code lien quan den camera va webcam
</commit_message>
<xml_diff>
--- a/Bao_Cao_ASL_Preprocessing_CNN.docx
+++ b/Bao_Cao_ASL_Preprocessing_CNN.docx
@@ -18081,7 +18081,7 @@
           <w:i w:val="0"/>
           <w:sz w:val="26"/>
         </w:rPr>
-        <w:t>• Giới hạn về sự đa dạng môi trường: Tập mẫu chưa bao quát được các yếu tố nhiễu thực tế như: người thực hiện có màu da khác nhau, điều kiện góc quay camera nghiêng, bóng đổ phức tạp từ ngoại cảnh, và phông nền chuyển động.</w:t>
+        <w:t>• Giới hạn về sự đa dạng môi trường: Tập mẫu chưa bao quát được các yếu tố nhiễu thực tế như: người thực hiện có màu da khác nhau, điều kiện góc chụp nghiêng, bóng đổ phức tạp từ ngoại cảnh, và phông nền chuyển động.</w:t>
       </w:r>
     </w:p>
     <w:p>
@@ -18173,7 +18173,7 @@
           <w:i w:val="0"/>
           <w:sz w:val="26"/>
         </w:rPr>
-        <w:t>4. Tối ưu hóa và đóng gói ứng dụng thời gian thực: Nghiên cứu các giải pháp nén mô hình (Quantization INT8, Pruning) và tích hợp pipeline vào ứng dụng camera thời gian thực trên các thiết bị nhúng như Raspberry Pi hoặc smartphone, đảm bảo tốc độ phản hồi trên 30 khung hình/giây (FPS).</w:t>
+        <w:t>4. Tối ưu hóa và đóng gói ứng dụng thời gian thực: Nghiên cứu các giải pháp nén mô hình (Quantization INT8, Pruning) và tích hợp pipeline vào ứng dụng nhận diện thời gian thực trên các thiết bị nhúng như Raspberry Pi hoặc smartphone, đảm bảo tốc độ phản hồi trên 30 khung hình/giây (FPS).</w:t>
       </w:r>
     </w:p>
     <w:p>

</xml_diff>